<commit_message>
Extend knowledge base to cover the concepts Procura implements
The knowledge base predated the research-grounded upgrades, so the AI
assistant had nothing to retrieve about EEVDF, MLFQ, Jain's index,
fair-share, EWMA/CUSUM or production deadlock practice; asked how EEVDF
differs from Round Robin it invented an expansion of the acronym. Adds
Advanced_Scheduling and Anomaly_Detection documents, extends Deadlocks
and Error_Recovery, routes burst-anomaly diagnoses to the new document,
and adds seven retrieval tests. Screenshots recaptured from a clean
state; 81 tests passing.

Co-Authored-By: Claude Opus 5.5 <noreply@anthropic.com>
</commit_message>
<xml_diff>
--- a/docs/Procura_Case_Study.docx
+++ b/docs/Procura_Case_Study.docx
@@ -1646,7 +1646,7 @@
           <w:sz w:val="22"/>
           <w:szCs w:val="22"/>
         </w:rPr>
-        <w:t xml:space="preserve">This report documents Procura as a complete case study: the problem it addresses, the objectives it set out to satisfy, a survey of the real-world and academic systems it draws on, the system it proposes and implements, its architecture and methodology, the software actually built and tested (74 automated tests across six test modules, all passing at the time of writing, verified by independent re-execution rather than taken on trust), and an honest discussion of its limitations, ethical considerations, and future scope. Wherever a quantitative claim is made in this report -- a test count, a benchmark result, an API endpoint list -- it is drawn directly from the working codebase at the time of writing, not estimated or projected.</w:t>
+        <w:t xml:space="preserve">This report documents Procura as a complete case study: the problem it addresses, the objectives it set out to satisfy, a survey of the real-world and academic systems it draws on, the system it proposes and implements, its architecture and methodology, the software actually built and tested (81 automated tests across seven test modules, all passing at the time of writing, verified by independent re-execution rather than taken on trust), and an honest discussion of its limitations, ethical considerations, and future scope. Wherever a quantitative claim is made in this report -- a test count, a benchmark result, an API endpoint list -- it is drawn directly from the working codebase at the time of writing, not estimated or projected.</w:t>
       </w:r>
     </w:p>
     <w:p>
@@ -5561,7 +5561,7 @@
                 <w:sz w:val="19"/>
                 <w:szCs w:val="19"/>
               </w:rPr>
-              <w:t xml:space="preserve">pytest and FastAPI's TestClient (74 automated tests)</w:t>
+              <w:t xml:space="preserve">pytest and FastAPI's TestClient (81 automated tests)</w:t>
             </w:r>
           </w:p>
         </w:tc>
@@ -8147,7 +8147,7 @@
           <w:sz w:val="22"/>
           <w:szCs w:val="22"/>
         </w:rPr>
-        <w:t xml:space="preserve">A 74-test automated pytest suite across six test modules (Table 7), passing in full, verified independently by re-execution rather than taken on trust.</w:t>
+        <w:t xml:space="preserve">An 81-test automated pytest suite across seven test modules (Table 7), passing in full, verified independently by re-execution rather than taken on trust.</w:t>
       </w:r>
     </w:p>
     <w:p>
@@ -11681,6 +11681,89 @@
           </w:p>
         </w:tc>
       </w:tr>
+      <w:tr>
+        <w:tc>
+          <w:tcPr>
+            <w:tcW w:type="dxa" w:w="2200"/>
+            <w:tcMar>
+              <w:top w:type="dxa" w:w="80"/>
+              <w:left w:type="dxa" w:w="120"/>
+              <w:bottom w:type="dxa" w:w="80"/>
+              <w:right w:type="dxa" w:w="120"/>
+            </w:tcMar>
+            <w:vAlign w:val="center"/>
+          </w:tcPr>
+          <w:p>
+            <w:pPr>
+              <w:jc w:val="left"/>
+            </w:pPr>
+            <w:r>
+              <w:rPr>
+                <w:b w:val="false"/>
+                <w:bCs w:val="false"/>
+                <w:color w:val="111111"/>
+                <w:sz w:val="19"/>
+                <w:szCs w:val="19"/>
+              </w:rPr>
+              <w:t xml:space="preserve">test_retrieval.py</w:t>
+            </w:r>
+          </w:p>
+        </w:tc>
+        <w:tc>
+          <w:tcPr>
+            <w:tcW w:type="dxa" w:w="1100"/>
+            <w:tcMar>
+              <w:top w:type="dxa" w:w="80"/>
+              <w:left w:type="dxa" w:w="120"/>
+              <w:bottom w:type="dxa" w:w="80"/>
+              <w:right w:type="dxa" w:w="120"/>
+            </w:tcMar>
+            <w:vAlign w:val="center"/>
+          </w:tcPr>
+          <w:p>
+            <w:pPr>
+              <w:jc w:val="left"/>
+            </w:pPr>
+            <w:r>
+              <w:rPr>
+                <w:b w:val="false"/>
+                <w:bCs w:val="false"/>
+                <w:color w:val="111111"/>
+                <w:sz w:val="19"/>
+                <w:szCs w:val="19"/>
+              </w:rPr>
+              <w:t xml:space="preserve">7</w:t>
+            </w:r>
+          </w:p>
+        </w:tc>
+        <w:tc>
+          <w:tcPr>
+            <w:tcW w:type="dxa" w:w="6050"/>
+            <w:tcMar>
+              <w:top w:type="dxa" w:w="80"/>
+              <w:left w:type="dxa" w:w="120"/>
+              <w:bottom w:type="dxa" w:w="80"/>
+              <w:right w:type="dxa" w:w="120"/>
+            </w:tcMar>
+            <w:vAlign w:val="center"/>
+          </w:tcPr>
+          <w:p>
+            <w:pPr>
+              <w:jc w:val="left"/>
+            </w:pPr>
+            <w:r>
+              <w:rPr>
+                <w:b w:val="false"/>
+                <w:bCs w:val="false"/>
+                <w:color w:val="111111"/>
+                <w:sz w:val="19"/>
+                <w:szCs w:val="19"/>
+              </w:rPr>
+              <w:t xml:space="preserve">Knowledge-base retrieval: each implemented concept (EEVDF, MLFQ, Jain's index, Modified Z-score, CUSUM, Banker's/wound-wait, preemption rules) retrieves the correct document</w:t>
+            </w:r>
+          </w:p>
+        </w:tc>
+      </w:tr>
     </w:tbl>
     <w:p>
       <w:pPr>
@@ -11695,7 +11778,7 @@
           <w:sz w:val="19"/>
           <w:szCs w:val="19"/>
         </w:rPr>
-        <w:t xml:space="preserve">Table 7. Automated test suite composition (74 tests total, 100% passing).</w:t>
+        <w:t xml:space="preserve">Table 7. Automated test suite composition (81 tests total, 100% passing).</w:t>
       </w:r>
     </w:p>
     <w:p>

</xml_diff>

<commit_message>
Update test counts to 82
Co-Authored-By: Claude Opus 5.5 <noreply@anthropic.com>
</commit_message>
<xml_diff>
--- a/docs/Procura_Case_Study.docx
+++ b/docs/Procura_Case_Study.docx
@@ -1646,7 +1646,7 @@
           <w:sz w:val="22"/>
           <w:szCs w:val="22"/>
         </w:rPr>
-        <w:t xml:space="preserve">This report documents Procura as a complete case study: the problem it addresses, the objectives it set out to satisfy, a survey of the real-world and academic systems it draws on, the system it proposes and implements, its architecture and methodology, the software actually built and tested (81 automated tests across seven test modules, all passing at the time of writing, verified by independent re-execution rather than taken on trust), and an honest discussion of its limitations, ethical considerations, and future scope. Wherever a quantitative claim is made in this report -- a test count, a benchmark result, an API endpoint list -- it is drawn directly from the working codebase at the time of writing, not estimated or projected.</w:t>
+        <w:t xml:space="preserve">This report documents Procura as a complete case study: the problem it addresses, the objectives it set out to satisfy, a survey of the real-world and academic systems it draws on, the system it proposes and implements, its architecture and methodology, the software actually built and tested (82 automated tests across seven test modules, all passing at the time of writing, verified by independent re-execution rather than taken on trust), and an honest discussion of its limitations, ethical considerations, and future scope. Wherever a quantitative claim is made in this report -- a test count, a benchmark result, an API endpoint list -- it is drawn directly from the working codebase at the time of writing, not estimated or projected.</w:t>
       </w:r>
     </w:p>
     <w:p>
@@ -5561,7 +5561,7 @@
                 <w:sz w:val="19"/>
                 <w:szCs w:val="19"/>
               </w:rPr>
-              <w:t xml:space="preserve">pytest and FastAPI's TestClient (81 automated tests)</w:t>
+              <w:t xml:space="preserve">pytest and FastAPI's TestClient (82 automated tests)</w:t>
             </w:r>
           </w:p>
         </w:tc>
@@ -8147,7 +8147,7 @@
           <w:sz w:val="22"/>
           <w:szCs w:val="22"/>
         </w:rPr>
-        <w:t xml:space="preserve">An 81-test automated pytest suite across seven test modules (Table 7), passing in full, verified independently by re-execution rather than taken on trust.</w:t>
+        <w:t xml:space="preserve">An 82-test automated pytest suite across seven test modules (Table 7), passing in full, verified independently by re-execution rather than taken on trust.</w:t>
       </w:r>
     </w:p>
     <w:p>
@@ -11394,7 +11394,7 @@
                 <w:sz w:val="19"/>
                 <w:szCs w:val="19"/>
               </w:rPr>
-              <w:t xml:space="preserve">17</w:t>
+              <w:t xml:space="preserve">18</w:t>
             </w:r>
           </w:p>
         </w:tc>
@@ -11778,7 +11778,7 @@
           <w:sz w:val="19"/>
           <w:szCs w:val="19"/>
         </w:rPr>
-        <w:t xml:space="preserve">Table 7. Automated test suite composition (81 tests total, 100% passing).</w:t>
+        <w:t xml:space="preserve">Table 7. Automated test suite composition (82 tests total, 100% passing).</w:t>
       </w:r>
     </w:p>
     <w:p>

</xml_diff>

<commit_message>
Skip finished processes in memory-failure detection; add demo walkthrough
The memory check ran over every process, so a COMPLETED or TERMINATED
task could be flagged and "recovered". Adds the screenshot-based demo
walkthrough document (docx + pdf). 83 tests passing.

Co-Authored-By: Claude Opus 5.5 <noreply@anthropic.com>
</commit_message>
<xml_diff>
--- a/docs/Procura_Case_Study.docx
+++ b/docs/Procura_Case_Study.docx
@@ -1646,7 +1646,7 @@
           <w:sz w:val="22"/>
           <w:szCs w:val="22"/>
         </w:rPr>
-        <w:t xml:space="preserve">This report documents Procura as a complete case study: the problem it addresses, the objectives it set out to satisfy, a survey of the real-world and academic systems it draws on, the system it proposes and implements, its architecture and methodology, the software actually built and tested (82 automated tests across seven test modules, all passing at the time of writing, verified by independent re-execution rather than taken on trust), and an honest discussion of its limitations, ethical considerations, and future scope. Wherever a quantitative claim is made in this report -- a test count, a benchmark result, an API endpoint list -- it is drawn directly from the working codebase at the time of writing, not estimated or projected.</w:t>
+        <w:t xml:space="preserve">This report documents Procura as a complete case study: the problem it addresses, the objectives it set out to satisfy, a survey of the real-world and academic systems it draws on, the system it proposes and implements, its architecture and methodology, the software actually built and tested (83 automated tests across seven test modules, all passing at the time of writing, verified by independent re-execution rather than taken on trust), and an honest discussion of its limitations, ethical considerations, and future scope. Wherever a quantitative claim is made in this report -- a test count, a benchmark result, an API endpoint list -- it is drawn directly from the working codebase at the time of writing, not estimated or projected.</w:t>
       </w:r>
     </w:p>
     <w:p>
@@ -5561,7 +5561,7 @@
                 <w:sz w:val="19"/>
                 <w:szCs w:val="19"/>
               </w:rPr>
-              <w:t xml:space="preserve">pytest and FastAPI's TestClient (82 automated tests)</w:t>
+              <w:t xml:space="preserve">pytest and FastAPI's TestClient (83 automated tests)</w:t>
             </w:r>
           </w:p>
         </w:tc>
@@ -8147,7 +8147,7 @@
           <w:sz w:val="22"/>
           <w:szCs w:val="22"/>
         </w:rPr>
-        <w:t xml:space="preserve">An 82-test automated pytest suite across seven test modules (Table 7), passing in full, verified independently by re-execution rather than taken on trust.</w:t>
+        <w:t xml:space="preserve">An 83-test automated pytest suite across seven test modules (Table 7), passing in full, verified independently by re-execution rather than taken on trust.</w:t>
       </w:r>
     </w:p>
     <w:p>
@@ -11394,7 +11394,7 @@
                 <w:sz w:val="19"/>
                 <w:szCs w:val="19"/>
               </w:rPr>
-              <w:t xml:space="preserve">18</w:t>
+              <w:t xml:space="preserve">19</w:t>
             </w:r>
           </w:p>
         </w:tc>
@@ -11778,7 +11778,7 @@
           <w:sz w:val="19"/>
           <w:szCs w:val="19"/>
         </w:rPr>
-        <w:t xml:space="preserve">Table 7. Automated test suite composition (82 tests total, 100% passing).</w:t>
+        <w:t xml:space="preserve">Table 7. Automated test suite composition (83 tests total, 100% passing).</w:t>
       </w:r>
     </w:p>
     <w:p>

</xml_diff>